<commit_message>
Book One narrator docx: use explicit page breaks so Google Docs splits chapters
Co-Authored-By: Claude <noreply@anthropic.com>
</commit_message>
<xml_diff>
--- a/book/genesis/saeren-chronicles/delivery/ebook/Saeren-Chronicles-Book-One-Hazel-Academy-r15-narrator.docx
+++ b/book/genesis/saeren-chronicles/delivery/ebook/Saeren-Chronicles-Book-One-Hazel-Academy-r15-narrator.docx
@@ -27,7 +27,14 @@
     </w:p>
     <w:p>
       <w:pPr>
-        <w:pageBreakBefore/>
+        <w:ind w:firstLine="0"/>
+      </w:pPr>
+      <w:r>
+        <w:br w:type="page"/>
+      </w:r>
+    </w:p>
+    <w:p>
+      <w:pPr>
         <w:jc w:val="center"/>
         <w:spacing w:before="480" w:after="240"/>
         <w:ind w:firstLine="0"/>
@@ -737,7 +744,14 @@
     </w:p>
     <w:p>
       <w:pPr>
-        <w:pageBreakBefore/>
+        <w:ind w:firstLine="0"/>
+      </w:pPr>
+      <w:r>
+        <w:br w:type="page"/>
+      </w:r>
+    </w:p>
+    <w:p>
+      <w:pPr>
         <w:jc w:val="center"/>
         <w:spacing w:before="480" w:after="240"/>
         <w:ind w:firstLine="0"/>
@@ -1390,7 +1404,14 @@
     </w:p>
     <w:p>
       <w:pPr>
-        <w:pageBreakBefore/>
+        <w:ind w:firstLine="0"/>
+      </w:pPr>
+      <w:r>
+        <w:br w:type="page"/>
+      </w:r>
+    </w:p>
+    <w:p>
+      <w:pPr>
         <w:jc w:val="center"/>
         <w:spacing w:before="480" w:after="240"/>
         <w:ind w:firstLine="0"/>
@@ -2097,7 +2118,14 @@
     </w:p>
     <w:p>
       <w:pPr>
-        <w:pageBreakBefore/>
+        <w:ind w:firstLine="0"/>
+      </w:pPr>
+      <w:r>
+        <w:br w:type="page"/>
+      </w:r>
+    </w:p>
+    <w:p>
+      <w:pPr>
         <w:jc w:val="center"/>
         <w:spacing w:before="480" w:after="240"/>
         <w:ind w:firstLine="0"/>
@@ -2732,7 +2760,14 @@
     </w:p>
     <w:p>
       <w:pPr>
-        <w:pageBreakBefore/>
+        <w:ind w:firstLine="0"/>
+      </w:pPr>
+      <w:r>
+        <w:br w:type="page"/>
+      </w:r>
+    </w:p>
+    <w:p>
+      <w:pPr>
         <w:jc w:val="center"/>
         <w:spacing w:before="480" w:after="240"/>
         <w:ind w:firstLine="0"/>
@@ -3286,7 +3321,14 @@
     </w:p>
     <w:p>
       <w:pPr>
-        <w:pageBreakBefore/>
+        <w:ind w:firstLine="0"/>
+      </w:pPr>
+      <w:r>
+        <w:br w:type="page"/>
+      </w:r>
+    </w:p>
+    <w:p>
+      <w:pPr>
         <w:jc w:val="center"/>
         <w:spacing w:before="480" w:after="240"/>
         <w:ind w:firstLine="0"/>
@@ -3792,7 +3834,14 @@
     </w:p>
     <w:p>
       <w:pPr>
-        <w:pageBreakBefore/>
+        <w:ind w:firstLine="0"/>
+      </w:pPr>
+      <w:r>
+        <w:br w:type="page"/>
+      </w:r>
+    </w:p>
+    <w:p>
+      <w:pPr>
         <w:jc w:val="center"/>
         <w:spacing w:before="480" w:after="240"/>
         <w:ind w:firstLine="0"/>
@@ -4412,7 +4461,14 @@
     </w:p>
     <w:p>
       <w:pPr>
-        <w:pageBreakBefore/>
+        <w:ind w:firstLine="0"/>
+      </w:pPr>
+      <w:r>
+        <w:br w:type="page"/>
+      </w:r>
+    </w:p>
+    <w:p>
+      <w:pPr>
         <w:jc w:val="center"/>
         <w:spacing w:before="480" w:after="240"/>
         <w:ind w:firstLine="0"/>
@@ -5017,7 +5073,14 @@
     </w:p>
     <w:p>
       <w:pPr>
-        <w:pageBreakBefore/>
+        <w:ind w:firstLine="0"/>
+      </w:pPr>
+      <w:r>
+        <w:br w:type="page"/>
+      </w:r>
+    </w:p>
+    <w:p>
+      <w:pPr>
         <w:jc w:val="center"/>
         <w:spacing w:before="480" w:after="240"/>
         <w:ind w:firstLine="0"/>
@@ -5499,7 +5562,14 @@
     </w:p>
     <w:p>
       <w:pPr>
-        <w:pageBreakBefore/>
+        <w:ind w:firstLine="0"/>
+      </w:pPr>
+      <w:r>
+        <w:br w:type="page"/>
+      </w:r>
+    </w:p>
+    <w:p>
+      <w:pPr>
         <w:jc w:val="center"/>
         <w:spacing w:before="480" w:after="240"/>
         <w:ind w:firstLine="0"/>
@@ -6047,7 +6117,14 @@
     </w:p>
     <w:p>
       <w:pPr>
-        <w:pageBreakBefore/>
+        <w:ind w:firstLine="0"/>
+      </w:pPr>
+      <w:r>
+        <w:br w:type="page"/>
+      </w:r>
+    </w:p>
+    <w:p>
+      <w:pPr>
         <w:jc w:val="center"/>
         <w:spacing w:before="480" w:after="240"/>
         <w:ind w:firstLine="0"/>
@@ -6565,7 +6642,14 @@
     </w:p>
     <w:p>
       <w:pPr>
-        <w:pageBreakBefore/>
+        <w:ind w:firstLine="0"/>
+      </w:pPr>
+      <w:r>
+        <w:br w:type="page"/>
+      </w:r>
+    </w:p>
+    <w:p>
+      <w:pPr>
         <w:jc w:val="center"/>
         <w:spacing w:before="480" w:after="240"/>
         <w:ind w:firstLine="0"/>
@@ -7185,7 +7269,14 @@
     </w:p>
     <w:p>
       <w:pPr>
-        <w:pageBreakBefore/>
+        <w:ind w:firstLine="0"/>
+      </w:pPr>
+      <w:r>
+        <w:br w:type="page"/>
+      </w:r>
+    </w:p>
+    <w:p>
+      <w:pPr>
         <w:jc w:val="center"/>
         <w:spacing w:before="480" w:after="240"/>
         <w:ind w:firstLine="0"/>
@@ -7655,7 +7746,14 @@
     </w:p>
     <w:p>
       <w:pPr>
-        <w:pageBreakBefore/>
+        <w:ind w:firstLine="0"/>
+      </w:pPr>
+      <w:r>
+        <w:br w:type="page"/>
+      </w:r>
+    </w:p>
+    <w:p>
+      <w:pPr>
         <w:jc w:val="center"/>
         <w:spacing w:before="480" w:after="240"/>
         <w:ind w:firstLine="0"/>
@@ -8134,7 +8232,14 @@
     </w:p>
     <w:p>
       <w:pPr>
-        <w:pageBreakBefore/>
+        <w:ind w:firstLine="0"/>
+      </w:pPr>
+      <w:r>
+        <w:br w:type="page"/>
+      </w:r>
+    </w:p>
+    <w:p>
+      <w:pPr>
         <w:jc w:val="center"/>
         <w:spacing w:before="480" w:after="240"/>
         <w:ind w:firstLine="0"/>
@@ -8706,7 +8811,14 @@
     </w:p>
     <w:p>
       <w:pPr>
-        <w:pageBreakBefore/>
+        <w:ind w:firstLine="0"/>
+      </w:pPr>
+      <w:r>
+        <w:br w:type="page"/>
+      </w:r>
+    </w:p>
+    <w:p>
+      <w:pPr>
         <w:jc w:val="center"/>
         <w:spacing w:before="480" w:after="240"/>
         <w:ind w:firstLine="0"/>
@@ -9407,7 +9519,14 @@
     </w:p>
     <w:p>
       <w:pPr>
-        <w:pageBreakBefore/>
+        <w:ind w:firstLine="0"/>
+      </w:pPr>
+      <w:r>
+        <w:br w:type="page"/>
+      </w:r>
+    </w:p>
+    <w:p>
+      <w:pPr>
         <w:jc w:val="center"/>
         <w:spacing w:before="480" w:after="240"/>
         <w:ind w:firstLine="0"/>
@@ -9871,7 +9990,14 @@
     </w:p>
     <w:p>
       <w:pPr>
-        <w:pageBreakBefore/>
+        <w:ind w:firstLine="0"/>
+      </w:pPr>
+      <w:r>
+        <w:br w:type="page"/>
+      </w:r>
+    </w:p>
+    <w:p>
+      <w:pPr>
         <w:jc w:val="center"/>
         <w:spacing w:before="480" w:after="240"/>
         <w:ind w:firstLine="0"/>

</xml_diff>